<commit_message>
Update Shadowrun asset operations rules and sheet
</commit_message>
<xml_diff>
--- a/Shadowrun/_GRAYLINE/Campaign Design/Asset Operations System - Working Rules.docx
+++ b/Shadowrun/_GRAYLINE/Campaign Design/Asset Operations System - Working Rules.docx
@@ -7079,6 +7079,18 @@
       </w:r>
     </w:p>
     <w:p>
+      <w:pPr/>
+      <w:r>
+        <w:t>The source of a Surplus point does not change its cash-out value. Earned, purchased, and Edge-generated Surplus all use the asset's current Business Level value. Cashing out Edge-generated Surplus spends the Surplus point but does not liquidate or remove the Edge. The Edge remains active and generates Surplus again at its next normal monthly cycle.</w:t>
+      </w:r>
+    </w:p>
+    <w:p>
+      <w:pPr/>
+      <w:r>
+        <w:t>If generated Surplus would raise a pool above 10, the excess cannot be banked. It must be spent during that month for a valid use or cashed out at the normal value.</w:t>
+      </w:r>
+    </w:p>
+    <w:p>
       <w:pPr>
         <w:pStyle w:val="Heading2"/>
       </w:pPr>
@@ -8103,12 +8115,125 @@
     </w:p>
     <w:p>
       <w:r>
-        <w:rPr>
-          <w:rFonts w:ascii="Aptos" w:hAnsi="Aptos"/>
-          <w:b w:val="0"/>
-          <w:color w:val="20262B"/>
-        </w:rPr>
-        <w:t>The generated Surplus is a guaranteed matching success equivalent against shortfalls. It does not add dice, create profit by itself, repair damage, or advance another project.</w:t>
+        <w:t>The generated Surplus is a guaranteed matching success equivalent against shortfalls. It does not add dice, automatically become cash, repair damage, or advance another project. It may be cashed out under the normal Surplus rules, but doing so removes that protection from the pool.</w:t>
+      </w:r>
+    </w:p>
+    <w:p>
+      <w:pPr>
+        <w:pStyle w:val="Heading2"/>
+      </w:pPr>
+      <w:r>
+        <w:t>Understanding Asset Edges</w:t>
+      </w:r>
+    </w:p>
+    <w:p>
+      <w:pPr/>
+      <w:r>
+        <w:t>Asset Edges are discrete purchased improvements, not steps on an upgrade ladder. The point value describes the complete Edge being purchased. A 3-point Edge is not normally improved into a 4-point Edge by paying for one more point; those ratings purchase different kinds of institutional advantages. Replacing one with another requires a new fictional implementation and follows the normal purchase, implementation, and liquidation rules.</w:t>
+      </w:r>
+    </w:p>
+    <w:p>
+      <w:pPr>
+        <w:pStyle w:val="Heading3"/>
+      </w:pPr>
+      <w:r>
+        <w:t>Operational Dice Edges: 1-3 Points</w:t>
+      </w:r>
+    </w:p>
+    <w:p>
+      <w:pPr/>
+      <w:r>
+        <w:t>A 1-3 point Edge improves routine operation. Its dice are added to every weekly Operations Roll, and any resulting successes remain flexible. The manager may allocate them to requirements, repairs, either Surplus pool, or another permitted use. These Edges represent advantages that actively help the operation perform: trained staff, efficient systems, dependable contracts, or similar working capacity.</w:t>
+      </w:r>
+    </w:p>
+    <w:p>
+      <w:pPr>
+        <w:pStyle w:val="Heading3"/>
+      </w:pPr>
+      <w:r>
+        <w:t>Guaranteed Surplus Edges: 4-6 Points</w:t>
+      </w:r>
+    </w:p>
+    <w:p>
+      <w:pPr/>
+      <w:r>
+        <w:t>A 4-6 point Edge purchases certainty rather than more dice. It generates guaranteed monthly Surplus assigned permanently to Operational Surplus or Social Capital Surplus. That reserve is narrower than a rolled success: it cannot satisfy a requirement as a rolled success or repair existing damage, but it can cover a matching shortfall, prevent matching Condition damage, or be cashed out.</w:t>
+      </w:r>
+    </w:p>
+    <w:p>
+      <w:pPr>
+        <w:pStyle w:val="Heading3"/>
+      </w:pPr>
+      <w:r>
+        <w:t>Why the Effect Changes at 4 Points</w:t>
+      </w:r>
+    </w:p>
+    <w:p>
+      <w:pPr/>
+      <w:r>
+        <w:t>The breakpoint is intentional. Weekly dice are more productive when the asset's Target Number is favorable, but they can fail. Guaranteed Surplus does not care how high the Target Number has become. As Condition and outside pressure make operations harder, the reliable, track-specific reserve becomes comparatively more valuable. Higher-point Edges therefore emphasize institutional resilience rather than a larger general bonus.</w:t>
+      </w:r>
+    </w:p>
+    <w:p>
+      <w:pPr>
+        <w:pStyle w:val="Heading3"/>
+      </w:pPr>
+      <w:r>
+        <w:t>Example Interpretations</w:t>
+      </w:r>
+    </w:p>
+    <w:p>
+      <w:pPr>
+        <w:pStyle w:val="ListBullet"/>
+      </w:pPr>
+      <w:r>
+        <w:t>Professional Security Staff 2: adds 2 dice to every weekly Operations Roll because the staff actively improves routine performance.</w:t>
+      </w:r>
+    </w:p>
+    <w:p>
+      <w:pPr>
+        <w:pStyle w:val="ListBullet"/>
+      </w:pPr>
+      <w:r>
+        <w:t>Experienced General Management 3: adds 3 dice to every weekly Operations Roll through capable recurring administration.</w:t>
+      </w:r>
+    </w:p>
+    <w:p>
+      <w:pPr>
+        <w:pStyle w:val="ListBullet"/>
+      </w:pPr>
+      <w:r>
+        <w:t>Hardened Security Infrastructure 4: generates 4 Operational Surplus each month because it reliably absorbs internal disruption.</w:t>
+      </w:r>
+    </w:p>
+    <w:p>
+      <w:pPr>
+        <w:pStyle w:val="ListBullet"/>
+      </w:pPr>
+      <w:r>
+        <w:t>Community Anchor 5: generates 5 Social Capital Surplus each month through durable neighborhood trust and support.</w:t>
+      </w:r>
+    </w:p>
+    <w:p>
+      <w:pPr>
+        <w:pStyle w:val="ListBullet"/>
+      </w:pPr>
+      <w:r>
+        <w:t>Institutional Community Support 6: generates 6 Social Capital Surplus each month as a defining external reserve.</w:t>
+      </w:r>
+    </w:p>
+    <w:p>
+      <w:pPr>
+        <w:pStyle w:val="Heading3"/>
+      </w:pPr>
+      <w:r>
+        <w:t>Generated Surplus and Cash-Out</w:t>
+      </w:r>
+    </w:p>
+    <w:p>
+      <w:pPr/>
+      <w:r>
+        <w:t>Once generated Surplus enters its assigned pool, it follows the same cash-out value as Surplus from any other source. Its origin does not need to be tracked separately. Cashing it out converts protection into money: the Surplus point is spent, while the durable Edge remains and generates again at the next monthly cycle. Liquidating or burning the Edge itself is a separate action.</w:t>
       </w:r>
     </w:p>
     <w:p>

</xml_diff>